<commit_message>
Sync AA course: pirate tie-break fix + complete 2-36 derivation
Mirrors the site repo: indifferent pirate votes against (caveat scoped to
2-51 and 2-52), n=1 note dropped from the Multiplication Game, and the
four-line n^3/8 derivation added to 2-36; refreshed PDF and Word booklet.

Co-Authored-By: Claude Opus 5 <noreply@anthropic.com>
Claude-Session: https://claude.ai/code/session_017H2TQ6fayJTeFf3Wp8mLoc
</commit_message>
<xml_diff>
--- a/aa/skiena/Skiena_Ch2_Explained_Simply.docx
+++ b/aa/skiena/Skiena_Ch2_Explained_Simply.docx
@@ -70,7 +70,7 @@
           <w:i/>
           <w:iCs/>
         </w:rPr>
-        <w:t xml:space="preserve">(Chapter 2). Every problem is restated in plain words and worked through with tiny numbers. Companion to the Algorithm Analysis with Python course.</w:t>
+        <w:t xml:space="preserve">(Chapter 2). Companion to the Algorithm Analysis with Python course.</w:t>
       </w:r>
     </w:p>
     <w:bookmarkStart w:id="15" w:name="cat-program-analysis"/>
@@ -16977,7 +16977,7 @@
         <w:t xml:space="preserve">n−i</w:t>
       </w:r>
       <w:r>
-        <w:t xml:space="preserve">. Using "sum up to b minus sum up to a−1", that inner sum equals</w:t>
+        <w:t xml:space="preserve">, which is</w:t>
       </w:r>
       <w:r>
         <w:t xml:space="preserve"> </w:t>
@@ -16989,7 +16989,7 @@
         <w:t xml:space="preserve">[(n−i)(n−i+1) − (i−1)i] / 2</w:t>
       </w:r>
       <w:r>
-        <w:t xml:space="preserve">. Writing</w:t>
+        <w:t xml:space="preserve">. Now write</w:t>
       </w:r>
       <w:r>
         <w:t xml:space="preserve"> </w:t>
@@ -17004,68 +17004,59 @@
         <w:t xml:space="preserve"> </w:t>
       </w:r>
       <w:r>
-        <w:t xml:space="preserve">and adding these up over</w:t>
-      </w:r>
-      <w:r>
-        <w:t xml:space="preserve"> </w:t>
-      </w:r>
-      <w:r>
-        <w:rPr>
-          <w:rStyle w:val="VerbatimChar"/>
-        </w:rPr>
-        <w:t xml:space="preserve">i = 1 .. m</w:t>
-      </w:r>
-      <w:r>
-        <w:t xml:space="preserve">, everything collapses to a strikingly clean result:</w:t>
-      </w:r>
-    </w:p>
-    <w:p>
-      <w:pPr>
-        <w:pStyle w:val="BodyText"/>
-      </w:pPr>
-      <w:r>
-        <w:t xml:space="preserve">T(n) = m</w:t>
-      </w:r>
-      <w:r>
-        <w:rPr>
-          <w:vertAlign w:val="superscript"/>
-        </w:rPr>
-        <w:t xml:space="preserve">3</w:t>
-      </w:r>
-      <w:r>
-        <w:t xml:space="preserve"> </w:t>
-      </w:r>
-      <w:r>
-        <w:t xml:space="preserve">= (n/2)</w:t>
-      </w:r>
-      <w:r>
-        <w:rPr>
-          <w:vertAlign w:val="superscript"/>
-        </w:rPr>
-        <w:t xml:space="preserve">3</w:t>
-      </w:r>
-      <w:r>
-        <w:t xml:space="preserve"> </w:t>
-      </w:r>
-      <w:r>
-        <w:t xml:space="preserve">= n</w:t>
-      </w:r>
-      <w:r>
-        <w:rPr>
-          <w:vertAlign w:val="superscript"/>
-        </w:rPr>
-        <w:t xml:space="preserve">3</w:t>
-      </w:r>
-      <w:r>
-        <w:t xml:space="preserve"> </w:t>
-      </w:r>
-      <w:r>
-        <w:t xml:space="preserve">/ 8</w:t>
-      </w:r>
-    </w:p>
-    <w:p>
-      <w:pPr>
-        <w:pStyle w:val="BodyText"/>
+        <w:t xml:space="preserve">and show the work:</w:t>
+      </w:r>
+    </w:p>
+    <w:p>
+      <w:pPr>
+        <w:pStyle w:val="SourceCode"/>
+      </w:pPr>
+      <w:r>
+        <w:rPr>
+          <w:rStyle w:val="VerbatimChar"/>
+        </w:rPr>
+        <w:t xml:space="preserve">T(n) = ∑i=1m [ (2m-i)(2m-i+1) - (i-1)i ] / 2</w:t>
+      </w:r>
+      <w:r>
+        <w:br/>
+      </w:r>
+      <w:r>
+        <w:rPr>
+          <w:rStyle w:val="VerbatimChar"/>
+        </w:rPr>
+        <w:t xml:space="preserve">     = ∑i=1m m(2m - 2i + 1)          # the bracket simplifies to 2m(2m-2i+1)</w:t>
+      </w:r>
+      <w:r>
+        <w:br/>
+      </w:r>
+      <w:r>
+        <w:rPr>
+          <w:rStyle w:val="VerbatimChar"/>
+        </w:rPr>
+        <w:t xml:space="preserve">     = m [ (2m-1) + (2m-3) + ... + 3 + 1 ]     # the odd numbers 1..2m-1</w:t>
+      </w:r>
+      <w:r>
+        <w:br/>
+      </w:r>
+      <w:r>
+        <w:rPr>
+          <w:rStyle w:val="VerbatimChar"/>
+        </w:rPr>
+        <w:t xml:space="preserve">     = m · m2                            # sum of the first m odd numbers is m2</w:t>
+      </w:r>
+      <w:r>
+        <w:br/>
+      </w:r>
+      <w:r>
+        <w:rPr>
+          <w:rStyle w:val="VerbatimChar"/>
+        </w:rPr>
+        <w:t xml:space="preserve">     = m3 = (n/2)3 = n3/8</w:t>
+      </w:r>
+    </w:p>
+    <w:p>
+      <w:pPr>
+        <w:pStyle w:val="FirstParagraph"/>
       </w:pPr>
       <w:r>
         <w:rPr>
@@ -22448,45 +22439,59 @@
           <w:b/>
           <w:bCs/>
         </w:rPr>
-        <w:t xml:space="preserve">One honest caveat (the assumption behind 2-52).</w:t>
-      </w:r>
-      <w:r>
-        <w:t xml:space="preserve"> </w:t>
-      </w:r>
-      <w:r>
-        <w:t xml:space="preserve">The single-dollar answer needs a tie-breaking rule. Skiena states only “survival first, then money”, which leaves open what a pirate does when a proposal gives him</w:t>
-      </w:r>
-      <w:r>
-        <w:t xml:space="preserve"> </w:t>
-      </w:r>
-      <w:r>
-        <w:rPr>
+        <w:t xml:space="preserve">One honest caveat (the assumption behind 2-51 and 2-52).</w:t>
+      </w:r>
+      <w:r>
+        <w:t xml:space="preserve"> </w:t>
+      </w:r>
+      <w:r>
+        <w:t xml:space="preserve">Skiena specifies survival first and money second, but does not say how a pirate votes when both outcomes give him exactly the same survival and money. The solutions here use the standard convention that an</w:t>
+      </w:r>
+      <w:r>
+        <w:t xml:space="preserve"> </w:t>
+      </w:r>
+      <w:r>
+        <w:rPr>
+          <w:b/>
+          <w:bCs/>
+        </w:rPr>
+        <w:t xml:space="preserve">indifferent pirate votes</w:t>
+      </w:r>
+      <w:r>
+        <w:rPr>
+          <w:b/>
+          <w:bCs/>
+        </w:rPr>
+        <w:t xml:space="preserve"> </w:t>
+      </w:r>
+      <w:r>
+        <w:rPr>
+          <w:b/>
+          <w:bCs/>
           <w:i/>
           <w:iCs/>
         </w:rPr>
-        <w:t xml:space="preserve">the same</w:t>
-      </w:r>
-      <w:r>
-        <w:t xml:space="preserve"> </w:t>
-      </w:r>
-      <w:r>
-        <w:t xml:space="preserve">outcome (same survival, same money) as letting the proposer drown. The clean “nobody dies” result assumes an indifferent pirate votes</w:t>
-      </w:r>
-      <w:r>
-        <w:t xml:space="preserve"> </w:t>
-      </w:r>
-      <w:r>
-        <w:rPr>
-          <w:b/>
-          <w:bCs/>
-        </w:rPr>
-        <w:t xml:space="preserve">for</w:t>
-      </w:r>
-      <w:r>
-        <w:t xml:space="preserve"> </w:t>
-      </w:r>
-      <w:r>
-        <w:t xml:space="preserve">the proposal (equivalently, would rather not throw a colleague overboard for nothing). Under the opposite tie-break the split shifts and some proposers do die. So the unique backward-induction answer requires stating that extra preference.</w:t>
+        <w:t xml:space="preserve">against</w:t>
+      </w:r>
+      <w:r>
+        <w:rPr>
+          <w:b/>
+          <w:bCs/>
+        </w:rPr>
+        <w:t xml:space="preserve"> </w:t>
+      </w:r>
+      <w:r>
+        <w:rPr>
+          <w:b/>
+          <w:bCs/>
+        </w:rPr>
+        <w:t xml:space="preserve">the current proposal</w:t>
+      </w:r>
+      <w:r>
+        <w:t xml:space="preserve"> </w:t>
+      </w:r>
+      <w:r>
+        <w:t xml:space="preserve">— equivalently, a non-proposer backs a proposal only if it makes him strictly better off in survival or money. Under this convention the backward-induction outcomes below follow (note the $300 case relies on it too: a pirate who would get $0 next round is actually paid $1, rather than assumed to vote yes for the same $0). A different tie-breaking rule can change the result.</w:t>
       </w:r>
     </w:p>
     <w:p>
@@ -22816,22 +22821,7 @@
         <w:t xml:space="preserve">n ≤ 9</w:t>
       </w:r>
       <w:r>
-        <w:t xml:space="preserve">. (The special case</w:t>
-      </w:r>
-      <w:r>
-        <w:t xml:space="preserve"> </w:t>
-      </w:r>
-      <w:r>
-        <w:rPr>
-          <w:rStyle w:val="VerbatimChar"/>
-        </w:rPr>
-        <w:t xml:space="preserve">n = 1</w:t>
-      </w:r>
-      <w:r>
-        <w:t xml:space="preserve"> </w:t>
-      </w:r>
-      <w:r>
-        <w:t xml:space="preserve">is a second-player win.) No search needed — a handful of divisions.</w:t>
+        <w:t xml:space="preserve">. No search needed — a handful of divisions.</w:t>
       </w:r>
     </w:p>
     <w:p>

</xml_diff>

<commit_message>
Sync AA course: 2-44 wording, 2-50 distinct, print code-wrap (audit round 3)
Mirrors the site repo: corrected 2-44 expected-loss interpretation and
'distinct nodes', 'distinct a,b,c,d' in 2-50, comments moved off clipping
lines, and a print code-wrap rule; refreshed PDF and Word booklet.

Co-Authored-By: Claude Opus 5 <noreply@anthropic.com>
Claude-Session: https://claude.ai/code/session_017H2TQ6fayJTeFf3Wp8mLoc
</commit_message>
<xml_diff>
--- a/aa/skiena/Skiena_Ch2_Explained_Simply.docx
+++ b/aa/skiena/Skiena_Ch2_Explained_Simply.docx
@@ -17015,7 +17015,7 @@
         <w:rPr>
           <w:rStyle w:val="VerbatimChar"/>
         </w:rPr>
-        <w:t xml:space="preserve">T(n) = ∑i=1m [ (2m-i)(2m-i+1) - (i-1)i ] / 2</w:t>
+        <w:t xml:space="preserve">T(n) = ∑ [ (2m-i)(2m-i+1) - (i-1)i ] / 2   (i = 1..m, n = 2m)</w:t>
       </w:r>
       <w:r>
         <w:br/>
@@ -17024,7 +17024,7 @@
         <w:rPr>
           <w:rStyle w:val="VerbatimChar"/>
         </w:rPr>
-        <w:t xml:space="preserve">     = ∑i=1m m(2m - 2i + 1)          # the bracket simplifies to 2m(2m-2i+1)</w:t>
+        <w:t xml:space="preserve">     = ∑ m(2m - 2i + 1)</w:t>
       </w:r>
       <w:r>
         <w:br/>
@@ -17033,7 +17033,7 @@
         <w:rPr>
           <w:rStyle w:val="VerbatimChar"/>
         </w:rPr>
-        <w:t xml:space="preserve">     = m [ (2m-1) + (2m-3) + ... + 3 + 1 ]     # the odd numbers 1..2m-1</w:t>
+        <w:t xml:space="preserve">       # numerator simplifies to 2m(2m - 2i + 1)</w:t>
       </w:r>
       <w:r>
         <w:br/>
@@ -17042,7 +17042,7 @@
         <w:rPr>
           <w:rStyle w:val="VerbatimChar"/>
         </w:rPr>
-        <w:t xml:space="preserve">     = m · m2                            # sum of the first m odd numbers is m2</w:t>
+        <w:t xml:space="preserve">     = m [ (2m-1) + (2m-3) + ... + 1 ]</w:t>
       </w:r>
       <w:r>
         <w:br/>
@@ -17051,7 +17051,25 @@
         <w:rPr>
           <w:rStyle w:val="VerbatimChar"/>
         </w:rPr>
-        <w:t xml:space="preserve">     = m3 = (n/2)3 = n3/8</w:t>
+        <w:t xml:space="preserve">       # these are the odd numbers 1 .. 2m-1</w:t>
+      </w:r>
+      <w:r>
+        <w:br/>
+      </w:r>
+      <w:r>
+        <w:rPr>
+          <w:rStyle w:val="VerbatimChar"/>
+        </w:rPr>
+        <w:t xml:space="preserve">     = m · m2 = m3 = (n/2)3 = n3/8</w:t>
+      </w:r>
+      <w:r>
+        <w:br/>
+      </w:r>
+      <w:r>
+        <w:rPr>
+          <w:rStyle w:val="VerbatimChar"/>
+        </w:rPr>
+        <w:t xml:space="preserve">       # the first m odd numbers sum to m2</w:t>
       </w:r>
     </w:p>
     <w:p>
@@ -19868,7 +19886,16 @@
         <w:rPr>
           <w:rStyle w:val="VerbatimChar"/>
         </w:rPr>
-        <w:t xml:space="preserve">                keep[j] = item          # evict a random held item, insert the new one</w:t>
+        <w:t xml:space="preserve">                keep[j] = item</w:t>
+      </w:r>
+      <w:r>
+        <w:br/>
+      </w:r>
+      <w:r>
+        <w:rPr>
+          <w:rStyle w:val="VerbatimChar"/>
+        </w:rPr>
+        <w:t xml:space="preserve">                # evict a random held item and insert the new one</w:t>
       </w:r>
       <w:r>
         <w:br/>
@@ -19967,7 +19994,37 @@
           <w:b/>
           <w:bCs/>
         </w:rPr>
-        <w:t xml:space="preserve">keep three copies of every item, on three well-spread-out nodes</w:t>
+        <w:t xml:space="preserve">keep three copies of every item, on three</w:t>
+      </w:r>
+      <w:r>
+        <w:rPr>
+          <w:b/>
+          <w:bCs/>
+        </w:rPr>
+        <w:t xml:space="preserve"> </w:t>
+      </w:r>
+      <w:r>
+        <w:rPr>
+          <w:b/>
+          <w:b/>
+          <w:bCs/>
+          <w:bCs/>
+        </w:rPr>
+        <w:t xml:space="preserve">distinct</w:t>
+      </w:r>
+      <w:r>
+        <w:rPr>
+          <w:b/>
+          <w:bCs/>
+        </w:rPr>
+        <w:t xml:space="preserve"> </w:t>
+      </w:r>
+      <w:r>
+        <w:rPr>
+          <w:b/>
+          <w:bCs/>
+        </w:rPr>
+        <w:t xml:space="preserve">nodes</w:t>
       </w:r>
       <w:r>
         <w:t xml:space="preserve">, and never let two items live on the exact same trio of nodes. An easy way: put item i on nodes i, i+1 and i+2 (wrapping around at the end). Now every item has three homes, every node still holds three items, and each item's trio of homes is different.</w:t>
@@ -20002,15 +20059,47 @@
         <w:pStyle w:val="BodyText"/>
       </w:pPr>
       <w:r>
-        <w:t xml:space="preserve">expected items lost ≈ 1000 × 1 / C(1000, 3) ≈ 6 × 10⁻⁶</w:t>
-      </w:r>
-    </w:p>
-    <w:p>
-      <w:pPr>
-        <w:pStyle w:val="BodyText"/>
-      </w:pPr>
-      <w:r>
-        <w:t xml:space="preserve">That is essentially zero. Almost always you lose nothing at all; in the rare unlucky case you lose about one item.</w:t>
+        <w:t xml:space="preserve">E[items lost] = 1000 / C(1000, 3) ≈ 6.02 × 10⁻⁶</w:t>
+      </w:r>
+    </w:p>
+    <w:p>
+      <w:pPr>
+        <w:pStyle w:val="BodyText"/>
+      </w:pPr>
+      <w:r>
+        <w:t xml:space="preserve">Read that carefully: it is</w:t>
+      </w:r>
+      <w:r>
+        <w:t xml:space="preserve"> </w:t>
+      </w:r>
+      <w:r>
+        <w:rPr>
+          <w:i/>
+          <w:iCs/>
+        </w:rPr>
+        <w:t xml:space="preserve">not</w:t>
+      </w:r>
+      <w:r>
+        <w:t xml:space="preserve"> </w:t>
+      </w:r>
+      <w:r>
+        <w:t xml:space="preserve">"6 lost per million items". It means the</w:t>
+      </w:r>
+      <w:r>
+        <w:t xml:space="preserve"> </w:t>
+      </w:r>
+      <w:r>
+        <w:rPr>
+          <w:b/>
+          <w:bCs/>
+        </w:rPr>
+        <w:t xml:space="preserve">expected number of items lost per 3-node failure is about 6 × 10⁻⁶</w:t>
+      </w:r>
+      <w:r>
+        <w:t xml:space="preserve"> </w:t>
+      </w:r>
+      <w:r>
+        <w:t xml:space="preserve">— equivalently, only about a 6-in-a-million chance that a given random 3-node failure destroys even one item. Almost always you lose nothing.</w:t>
       </w:r>
     </w:p>
     <w:p>
@@ -20028,7 +20117,7 @@
         <w:t xml:space="preserve"> </w:t>
       </w:r>
       <w:r>
-        <w:t xml:space="preserve">Three copies per item, spread over well-separated nodes so no two items share a trio. With 3 random node failures the expected loss is essentially zero (about 6 in a million items).</w:t>
+        <w:t xml:space="preserve">Keep three copies of each item on three distinct nodes, with no two items sharing the same trio. The expected number of items lost when 3 random nodes fail is 1000 / C(1000, 3) ≈ 6.02 × 10⁻⁶ — i.e. about a 6-in-a-million chance that one item is lost, essentially zero.</w:t>
       </w:r>
     </w:p>
     <w:p>

</xml_diff>